<commit_message>
feat(methodology, srs): update expert panel form, update app wireframe, include file extensions
</commit_message>
<xml_diff>
--- a/chapters/appendices/Appendices.docx
+++ b/chapters/appendices/Appendices.docx
@@ -671,7 +671,7 @@
         </w:numPr>
       </w:pPr>
       <w:r>
-        <w:t xml:space="preserve">Accept a GenAI image by drag-drop, file browse, or bundled sample.</w:t>
+        <w:t xml:space="preserve">Accept a GenAI image by drag-drop, file browse, or a bundled sample — drawn from a pool of at least 10 real AI-generated demo images, never part of any training data, with 3 offered at random each start-up.</w:t>
       </w:r>
     </w:p>
     <w:p>
@@ -1233,7 +1233,13 @@
         <w:t xml:space="preserve"> </w:t>
       </w:r>
       <w:r>
-        <w:t xml:space="preserve">— one card per detected crop: the crop thumbnail, its Top-K font shortlist (name · preview · similarity bar), and a</w:t>
+        <w:t xml:space="preserve">— a carousel showing one card at a time per detected crop, navigated with previous/next arrows, a region indicator (</w:t>
+      </w:r>
+      <w:r>
+        <w:t xml:space="preserve">“Region 1 of 2”</w:t>
+      </w:r>
+      <w:r>
+        <w:t xml:space="preserve">), and pagination dots. Each card holds the crop thumbnail, its Top-K font shortlist (name · preview · similarity bar), and a</w:t>
       </w:r>
       <w:r>
         <w:t xml:space="preserve"> </w:t>
@@ -1340,7 +1346,7 @@
           <w:i/>
           <w:iCs/>
         </w:rPr>
-        <w:t xml:space="preserve">Figure. FontID wireframe: three-zone single page. Region 1 accepts (Top-3 in palette); Region 2 is rejected as out-of-palette (max similarity &lt; τ), demonstrating open-set behavior.</w:t>
+        <w:t xml:space="preserve">Figure. FontID wireframe: three-zone single page. Results are a carousel, one card per detected region: Region 1 accepts (Top-3 in palette); Region 2, reached with the next arrow, is rejected as out-of-palette (max similarity &lt; τ), demonstrating open-set behavior.</w:t>
       </w:r>
     </w:p>
     <w:bookmarkEnd w:id="23"/>
@@ -1789,7 +1795,46 @@
               <w:jc w:val="left"/>
             </w:pPr>
             <w:r>
-              <w:t xml:space="preserve">The system shall accept PNG, JPG, and WEBP up to 10 MB and reject other types with a clear message.</w:t>
+              <w:t xml:space="preserve">The system shall accept raster images in PNG (</w:t>
+            </w:r>
+            <w:r>
+              <w:rPr>
+                <w:rStyle w:val="VerbatimChar"/>
+              </w:rPr>
+              <w:t xml:space="preserve">.png</w:t>
+            </w:r>
+            <w:r>
+              <w:t xml:space="preserve">), JPEG (</w:t>
+            </w:r>
+            <w:r>
+              <w:rPr>
+                <w:rStyle w:val="VerbatimChar"/>
+              </w:rPr>
+              <w:t xml:space="preserve">.jpg</w:t>
+            </w:r>
+            <w:r>
+              <w:t xml:space="preserve">,</w:t>
+            </w:r>
+            <w:r>
+              <w:t xml:space="preserve"> </w:t>
+            </w:r>
+            <w:r>
+              <w:rPr>
+                <w:rStyle w:val="VerbatimChar"/>
+              </w:rPr>
+              <w:t xml:space="preserve">.jpeg</w:t>
+            </w:r>
+            <w:r>
+              <w:t xml:space="preserve">), and WebP (</w:t>
+            </w:r>
+            <w:r>
+              <w:rPr>
+                <w:rStyle w:val="VerbatimChar"/>
+              </w:rPr>
+              <w:t xml:space="preserve">.webp</w:t>
+            </w:r>
+            <w:r>
+              <w:t xml:space="preserve">) up to 10 MB, and reject any other type (e.g., SVG, GIF, HEIC, TIFF) with a clear message.</w:t>
             </w:r>
           </w:p>
         </w:tc>
@@ -1828,6 +1873,44 @@
             </w:pPr>
             <w:r>
               <w:t xml:space="preserve">The system shall display a preview of the uploaded image before processing.</w:t>
+            </w:r>
+          </w:p>
+        </w:tc>
+        <w:tc>
+          <w:tcPr/>
+          <w:p>
+            <w:pPr>
+              <w:pStyle w:val="Compact"/>
+              <w:jc w:val="left"/>
+            </w:pPr>
+            <w:r>
+              <w:t xml:space="preserve">Med</w:t>
+            </w:r>
+          </w:p>
+        </w:tc>
+      </w:tr>
+      <w:tr>
+        <w:tc>
+          <w:tcPr/>
+          <w:p>
+            <w:pPr>
+              <w:pStyle w:val="Compact"/>
+              <w:jc w:val="left"/>
+            </w:pPr>
+            <w:r>
+              <w:t xml:space="preserve">REQ-4.1-4</w:t>
+            </w:r>
+          </w:p>
+        </w:tc>
+        <w:tc>
+          <w:tcPr/>
+          <w:p>
+            <w:pPr>
+              <w:pStyle w:val="Compact"/>
+              <w:jc w:val="left"/>
+            </w:pPr>
+            <w:r>
+              <w:t xml:space="preserve">The app shall bundle a pool of at least 10 real AI-generated sample images (e.g., DALL·E, Midjourney, Stable Diffusion output), none part of any training data; the samples offered shall be randomly selected from this pool at each start-up, and the interface shall label their origin.</w:t>
             </w:r>
           </w:p>
         </w:tc>
@@ -2290,7 +2373,16 @@
               <w:jc w:val="left"/>
             </w:pPr>
             <w:r>
-              <w:t xml:space="preserve">The system shall present each crop’s result as its own card, labeled KNOWN or UNKNOWN.</w:t>
+              <w:t xml:space="preserve">The system shall present each crop’s result as its own card in a carousel with previous/next navigation and a region indicator (e.g.,</w:t>
+            </w:r>
+            <w:r>
+              <w:t xml:space="preserve"> </w:t>
+            </w:r>
+            <w:r>
+              <w:t xml:space="preserve">“Region 1 of 2”</w:t>
+            </w:r>
+            <w:r>
+              <w:t xml:space="preserve">), each card labeled KNOWN or UNKNOWN.</w:t>
             </w:r>
           </w:p>
         </w:tc>
@@ -2329,6 +2421,44 @@
             </w:pPr>
             <w:r>
               <w:t xml:space="preserve">The system should report a typographic-distance (SSIM) score between the crop and the top match.</w:t>
+            </w:r>
+          </w:p>
+        </w:tc>
+        <w:tc>
+          <w:tcPr/>
+          <w:p>
+            <w:pPr>
+              <w:pStyle w:val="Compact"/>
+              <w:jc w:val="left"/>
+            </w:pPr>
+            <w:r>
+              <w:t xml:space="preserve">Low</w:t>
+            </w:r>
+          </w:p>
+        </w:tc>
+      </w:tr>
+      <w:tr>
+        <w:tc>
+          <w:tcPr/>
+          <w:p>
+            <w:pPr>
+              <w:pStyle w:val="Compact"/>
+              <w:jc w:val="left"/>
+            </w:pPr>
+            <w:r>
+              <w:t xml:space="preserve">REQ-4.3-5</w:t>
+            </w:r>
+          </w:p>
+        </w:tc>
+        <w:tc>
+          <w:tcPr/>
+          <w:p>
+            <w:pPr>
+              <w:pStyle w:val="Compact"/>
+              <w:jc w:val="left"/>
+            </w:pPr>
+            <w:r>
+              <w:t xml:space="preserve">The backend should log each crop’s similarity scores and its threshold (τ) decision for researcher analysis; these diagnostics are not shown in the user interface.</w:t>
             </w:r>
           </w:p>
         </w:tc>
@@ -2990,6 +3120,137 @@
         <w:br w:type="page"/>
       </w:r>
     </w:p>
+    <w:bookmarkEnd w:id="35"/>
+    <w:bookmarkEnd w:id="36"/>
+    <w:bookmarkStart w:id="40" w:name="appendix-expert-panel-rating-form"/>
+    <w:p>
+      <w:pPr>
+        <w:pStyle w:val="Heading1"/>
+      </w:pPr>
+      <w:r>
+        <w:t xml:space="preserve">Appendix: Expert-Panel Rating Form</w:t>
+      </w:r>
+    </w:p>
+    <w:p>
+      <w:pPr>
+        <w:pStyle w:val="FirstParagraph"/>
+      </w:pPr>
+      <w:r>
+        <w:t xml:space="preserve">This appendix reproduces the layout of the web-based rating form that delivers the human-proxy consensus instrument of Section 4.2.3. The form has two screens. Screen A is shown once: it states the task, the ground rules (independent, self-paced, blind to the model’s predictions and to the other raters), and the palette reference sheet the rater keeps open while rating. Screen B repeats for each of the [N = 100] real generative text crops: the crop is displayed beside an excerpt of the reference sheet, and the rater makes exactly one required choice — the closest palette font, found through a searchable list, or the</w:t>
+      </w:r>
+      <w:r>
+        <w:t xml:space="preserve"> </w:t>
+      </w:r>
+      <w:r>
+        <w:t xml:space="preserve">“Unknown / hallucinated”</w:t>
+      </w:r>
+      <w:r>
+        <w:t xml:space="preserve"> </w:t>
+      </w:r>
+      <w:r>
+        <w:t xml:space="preserve">verdict when no palette font matches.</w:t>
+      </w:r>
+    </w:p>
+    <w:p>
+      <w:pPr>
+        <w:pStyle w:val="BodyText"/>
+      </w:pPr>
+      <w:r>
+        <w:t xml:space="preserve">The layout is platform-neutral: it specifies the content and controls of each screen, not a hosting service, so any standard web-form platform can deliver it without altering the instrument. The item texts shown (crop wording, specimen names, item counter) are illustrative.</w:t>
+      </w:r>
+    </w:p>
+    <w:p>
+      <w:pPr>
+        <w:pStyle w:val="BodyText"/>
+      </w:pPr>
+      <w:r>
+        <w:rPr>
+          <w:b/>
+          <w:bCs/>
+        </w:rPr>
+        <w:t xml:space="preserve">Figure A1</w:t>
+      </w:r>
+    </w:p>
+    <w:p>
+      <w:pPr>
+        <w:pStyle w:val="BodyText"/>
+      </w:pPr>
+      <w:r>
+        <w:rPr>
+          <w:i/>
+          <w:iCs/>
+        </w:rPr>
+        <w:t xml:space="preserve">Expert-Panel Rating Form — Instructions Screen and Per-Crop Rating Item</w:t>
+      </w:r>
+    </w:p>
+    <w:p>
+      <w:pPr>
+        <w:pStyle w:val="CaptionedFigure"/>
+      </w:pPr>
+      <w:r>
+        <w:drawing>
+          <wp:inline>
+            <wp:extent cx="5334000" cy="2830778"/>
+            <wp:effectExtent b="0" l="0" r="0" t="0"/>
+            <wp:docPr descr="Two-panel wireframe. Panel A, the instructions screen: task description (rate 100 text crops from AI-generated images, pick the closest Google Font or mark Unknown/hallucinated), ground rules (work independently, self-paced, never shown the model’s predictions or other raters’ answers), a callout for the palette reference sheet, and a begin button. Panel B, the rating item: an item counter with progress bar, the AI-generated text crop displayed beside a palette-reference-sheet excerpt of labeled specimens, a required question with a searchable palette dropdown, an alternative Unknown/hallucinated radio option, and Back / Save-and-next buttons with per-item saving noted" title="" id="38" name="Picture"/>
+            <a:graphic>
+              <a:graphicData uri="http://schemas.openxmlformats.org/drawingml/2006/picture">
+                <pic:pic>
+                  <pic:nvPicPr>
+                    <pic:cNvPr descr="../../../assets/figures/expert_panel_form.png" id="39" name="Picture"/>
+                    <pic:cNvPicPr>
+                      <a:picLocks noChangeArrowheads="1" noChangeAspect="1"/>
+                    </pic:cNvPicPr>
+                  </pic:nvPicPr>
+                  <pic:blipFill>
+                    <a:blip r:embed="rId37"/>
+                    <a:stretch>
+                      <a:fillRect/>
+                    </a:stretch>
+                  </pic:blipFill>
+                  <pic:spPr bwMode="auto">
+                    <a:xfrm>
+                      <a:off x="0" y="0"/>
+                      <a:ext cx="5334000" cy="2830778"/>
+                    </a:xfrm>
+                    <a:prstGeom prst="rect">
+                      <a:avLst/>
+                    </a:prstGeom>
+                    <a:noFill/>
+                    <a:ln w="9525">
+                      <a:noFill/>
+                      <a:headEnd/>
+                      <a:tailEnd/>
+                    </a:ln>
+                  </pic:spPr>
+                </pic:pic>
+              </a:graphicData>
+            </a:graphic>
+          </wp:inline>
+        </w:drawing>
+      </w:r>
+    </w:p>
+    <w:p>
+      <w:pPr>
+        <w:pStyle w:val="ImageCaption"/>
+      </w:pPr>
+      <w:r>
+        <w:t xml:space="preserve">Two-panel wireframe. Panel A, the instructions screen: task description (rate 100 text crops from AI-generated images, pick the closest Google Font or mark Unknown/hallucinated), ground rules (work independently, self-paced, never shown the model’s predictions or other raters’ answers), a callout for the palette reference sheet, and a begin button. Panel B, the rating item: an item counter with progress bar, the AI-generated text crop displayed beside a palette-reference-sheet excerpt of labeled specimens, a required question with a searchable palette dropdown, an alternative Unknown/hallucinated radio option, and Back / Save-and-next buttons with per-item saving noted</w:t>
+      </w:r>
+    </w:p>
+    <w:p>
+      <w:pPr>
+        <w:pStyle w:val="BodyText"/>
+      </w:pPr>
+      <w:r>
+        <w:t xml:space="preserve">Per-item responses save individually, so a rater may pause and resume without loss; each rater submits one complete response set, and the three sets are combined under the 2-of-3 consensus rule of Section 4.2.3.</w:t>
+      </w:r>
+    </w:p>
+    <w:p>
+      <w:r>
+        <w:br w:type="page"/>
+      </w:r>
+    </w:p>
     <w:p>
       <w:pPr>
         <w:pStyle w:val="BodyText"/>
@@ -3891,8 +4152,7 @@
         <w:t xml:space="preserve">&lt;Position&gt;</w:t>
       </w:r>
     </w:p>
-    <w:bookmarkEnd w:id="35"/>
-    <w:bookmarkEnd w:id="36"/>
+    <w:bookmarkEnd w:id="40"/>
     <w:sectPr>
       <w:footnotePr>
         <w:numRestart w:val="eachSect"/>

</xml_diff>